<commit_message>
añadidos de casos de uso, diagrams de secuencia y clases
</commit_message>
<xml_diff>
--- a/Atlantic_City_FINAL_G5.docx
+++ b/Atlantic_City_FINAL_G5.docx
@@ -4490,7 +4490,7 @@
       <w:r>
         <w:drawing>
           <wp:inline xmlns:a="http://schemas.openxmlformats.org/drawingml/2006/main" xmlns:pic="http://schemas.openxmlformats.org/drawingml/2006/picture">
-            <wp:extent cx="5400000" cy="3600000"/>
+            <wp:extent cx="5400000" cy="3372332"/>
             <wp:docPr id="4" name="Picture 4"/>
             <wp:cNvGraphicFramePr>
               <a:graphicFrameLocks noChangeAspect="1"/>
@@ -4511,7 +4511,7 @@
                   <pic:spPr>
                     <a:xfrm>
                       <a:off x="0" y="0"/>
-                      <a:ext cx="5400000" cy="3600000"/>
+                      <a:ext cx="5400000" cy="3372332"/>
                     </a:xfrm>
                     <a:prstGeom prst="rect"/>
                   </pic:spPr>
@@ -4543,7 +4543,7 @@
       <w:r>
         <w:drawing>
           <wp:inline xmlns:a="http://schemas.openxmlformats.org/drawingml/2006/main" xmlns:pic="http://schemas.openxmlformats.org/drawingml/2006/picture">
-            <wp:extent cx="5400000" cy="3600000"/>
+            <wp:extent cx="5400000" cy="3372332"/>
             <wp:docPr id="5" name="Picture 5"/>
             <wp:cNvGraphicFramePr>
               <a:graphicFrameLocks noChangeAspect="1"/>
@@ -4564,7 +4564,7 @@
                   <pic:spPr>
                     <a:xfrm>
                       <a:off x="0" y="0"/>
-                      <a:ext cx="5400000" cy="3600000"/>
+                      <a:ext cx="5400000" cy="3372332"/>
                     </a:xfrm>
                     <a:prstGeom prst="rect"/>
                   </pic:spPr>
@@ -5456,7 +5456,7 @@
       <w:r>
         <w:drawing>
           <wp:inline xmlns:a="http://schemas.openxmlformats.org/drawingml/2006/main" xmlns:pic="http://schemas.openxmlformats.org/drawingml/2006/picture">
-            <wp:extent cx="5760000" cy="3506087"/>
+            <wp:extent cx="5760000" cy="3788948"/>
             <wp:docPr id="6" name="Picture 6"/>
             <wp:cNvGraphicFramePr>
               <a:graphicFrameLocks noChangeAspect="1"/>
@@ -5477,7 +5477,7 @@
                   <pic:spPr>
                     <a:xfrm>
                       <a:off x="0" y="0"/>
-                      <a:ext cx="5760000" cy="3506087"/>
+                      <a:ext cx="5760000" cy="3788948"/>
                     </a:xfrm>
                     <a:prstGeom prst="rect"/>
                   </pic:spPr>
@@ -9942,7 +9942,7 @@
       <w:r>
         <w:drawing>
           <wp:inline xmlns:a="http://schemas.openxmlformats.org/drawingml/2006/main" xmlns:pic="http://schemas.openxmlformats.org/drawingml/2006/picture">
-            <wp:extent cx="5760000" cy="4658824"/>
+            <wp:extent cx="5760000" cy="4151061"/>
             <wp:docPr id="10" name="Picture 10"/>
             <wp:cNvGraphicFramePr>
               <a:graphicFrameLocks noChangeAspect="1"/>
@@ -9963,7 +9963,7 @@
                   <pic:spPr>
                     <a:xfrm>
                       <a:off x="0" y="0"/>
-                      <a:ext cx="5760000" cy="4658824"/>
+                      <a:ext cx="5760000" cy="4151061"/>
                     </a:xfrm>
                     <a:prstGeom prst="rect"/>
                   </pic:spPr>

</xml_diff>